<commit_message>
docs: gera o Documento Tecnico tambem em PDF
scripts/gerar-pdf.py converte o .docx usando o proprio Word, por automacao
COM. A escolha preserva a formatacao com fidelidade e, diferentemente de
conversores externos, permite atualizar o campo de sumario antes da
exportacao — o PDF sai com titulos e paginas ja preenchidos.

Corrige tambem a fonte dos titulos. Os estilos de titulo herdam a fonte
principal do tema do documento, e definir apenas `font.name` nao surtia
efeito: era necessario remover a referencia ao tema em rFonts, caso
contrario o Word aplicava a fonte do tema e os titulos saiam sem serifa,
destoando do corpo do texto.

Resultado: 38 paginas, 9 figuras, 10 tabelas numeradas e sumario com
paginacao correta.

Co-Authored-By: Claude Opus 5 (1M context) <noreply@anthropic.com>
</commit_message>
<xml_diff>
--- a/docs/academico/Documento Tecnico - Fleet Manager.docx
+++ b/docs/academico/Documento Tecnico - Fleet Manager.docx
@@ -9581,7 +9581,7 @@
       <w:outlineLvl w:val="0"/>
     </w:pPr>
     <w:rPr>
-      <w:rFonts w:asciiTheme="majorHAnsi" w:eastAsiaTheme="majorEastAsia" w:hAnsiTheme="majorHAnsi" w:cstheme="majorBidi" w:ascii="Times New Roman" w:hAnsi="Times New Roman"/>
+      <w:rFonts w:ascii="Times New Roman" w:hAnsi="Times New Roman" w:cs="Times New Roman" w:eastAsia="Times New Roman"/>
       <w:b/>
       <w:bCs/>
       <w:color w:val="000000"/>
@@ -9605,7 +9605,7 @@
       <w:outlineLvl w:val="1"/>
     </w:pPr>
     <w:rPr>
-      <w:rFonts w:asciiTheme="majorHAnsi" w:eastAsiaTheme="majorEastAsia" w:hAnsiTheme="majorHAnsi" w:cstheme="majorBidi" w:ascii="Times New Roman" w:hAnsi="Times New Roman"/>
+      <w:rFonts w:ascii="Times New Roman" w:hAnsi="Times New Roman" w:cs="Times New Roman" w:eastAsia="Times New Roman"/>
       <w:b/>
       <w:bCs/>
       <w:color w:val="000000"/>
@@ -9629,7 +9629,7 @@
       <w:outlineLvl w:val="2"/>
     </w:pPr>
     <w:rPr>
-      <w:rFonts w:asciiTheme="majorHAnsi" w:eastAsiaTheme="majorEastAsia" w:hAnsiTheme="majorHAnsi" w:cstheme="majorBidi" w:ascii="Times New Roman" w:hAnsi="Times New Roman"/>
+      <w:rFonts w:ascii="Times New Roman" w:hAnsi="Times New Roman" w:cs="Times New Roman" w:eastAsia="Times New Roman"/>
       <w:b/>
       <w:bCs/>
       <w:color w:val="000000"/>

</xml_diff>